<commit_message>
added year in desc ds, update readme
</commit_message>
<xml_diff>
--- a/protocol_logbook.docx
+++ b/protocol_logbook.docx
@@ -1,6 +1,6 @@
 
 <file path=word/document.xml><?xml version="1.0" encoding="utf-8"?>
-<w:document xmlns:wpc="http://schemas.microsoft.com/office/word/2010/wordprocessingCanvas" xmlns:cx="http://schemas.microsoft.com/office/drawing/2014/chartex" xmlns:cx1="http://schemas.microsoft.com/office/drawing/2015/9/8/chartex" xmlns:cx2="http://schemas.microsoft.com/office/drawing/2015/10/21/chartex" xmlns:cx3="http://schemas.microsoft.com/office/drawing/2016/5/9/chartex" xmlns:cx4="http://schemas.microsoft.com/office/drawing/2016/5/10/chartex" xmlns:cx5="http://schemas.microsoft.com/office/drawing/2016/5/11/chartex" xmlns:cx6="http://schemas.microsoft.com/office/drawing/2016/5/12/chartex" xmlns:cx7="http://schemas.microsoft.com/office/drawing/2016/5/13/chartex" xmlns:cx8="http://schemas.microsoft.com/office/drawing/2016/5/14/chartex" xmlns:mc="http://schemas.openxmlformats.org/markup-compatibility/2006" xmlns:aink="http://schemas.microsoft.com/office/drawing/2016/ink" xmlns:am3d="http://schemas.microsoft.com/office/drawing/2017/model3d" xmlns:o="urn:schemas-microsoft-com:office:office" xmlns:oel="http://schemas.microsoft.com/office/2019/extlst" xmlns:r="http://schemas.openxmlformats.org/officeDocument/2006/relationships" xmlns:m="http://schemas.openxmlformats.org/officeDocument/2006/math" xmlns:v="urn:schemas-microsoft-com:vml" xmlns:wp14="http://schemas.microsoft.com/office/word/2010/wordprocessingDrawing" xmlns:wp="http://schemas.openxmlformats.org/drawingml/2006/wordprocessingDrawing" xmlns:w10="urn:schemas-microsoft-com:office:word" xmlns:w="http://schemas.openxmlformats.org/wordprocessingml/2006/main" xmlns:w14="http://schemas.microsoft.com/office/word/2010/wordml" xmlns:w15="http://schemas.microsoft.com/office/word/2012/wordml" xmlns:w16cex="http://schemas.microsoft.com/office/word/2018/wordml/cex" xmlns:w16cid="http://schemas.microsoft.com/office/word/2016/wordml/cid" xmlns:w16="http://schemas.microsoft.com/office/word/2018/wordml" xmlns:w16du="http://schemas.microsoft.com/office/word/2023/wordml/word16du" xmlns:w16sdtdh="http://schemas.microsoft.com/office/word/2020/wordml/sdtdatahash" xmlns:w16sdtfl="http://schemas.microsoft.com/office/word/2024/wordml/sdtformatlock" xmlns:w16se="http://schemas.microsoft.com/office/word/2015/wordml/symex" xmlns:wpg="http://schemas.microsoft.com/office/word/2010/wordprocessingGroup" xmlns:wpi="http://schemas.microsoft.com/office/word/2010/wordprocessingInk" xmlns:wne="http://schemas.microsoft.com/office/word/2006/wordml" xmlns:wps="http://schemas.microsoft.com/office/word/2010/wordprocessingShape" mc:Ignorable="w14 w15 w16se w16cid w16 w16cex w16sdtdh w16sdtfl w16du wp14">
+<w:document xmlns:wpc="http://schemas.microsoft.com/office/word/2010/wordprocessingCanvas" xmlns:cx="http://schemas.microsoft.com/office/drawing/2014/chartex" xmlns:cx1="http://schemas.microsoft.com/office/drawing/2015/9/8/chartex" xmlns:cx2="http://schemas.microsoft.com/office/drawing/2015/10/21/chartex" xmlns:cx3="http://schemas.microsoft.com/office/drawing/2016/5/9/chartex" xmlns:cx4="http://schemas.microsoft.com/office/drawing/2016/5/10/chartex" xmlns:cx5="http://schemas.microsoft.com/office/drawing/2016/5/11/chartex" xmlns:cx6="http://schemas.microsoft.com/office/drawing/2016/5/12/chartex" xmlns:cx7="http://schemas.microsoft.com/office/drawing/2016/5/13/chartex" xmlns:cx8="http://schemas.microsoft.com/office/drawing/2016/5/14/chartex" xmlns:mc="http://schemas.openxmlformats.org/markup-compatibility/2006" xmlns:aink="http://schemas.microsoft.com/office/drawing/2016/ink" xmlns:am3d="http://schemas.microsoft.com/office/drawing/2017/model3d" xmlns:o="urn:schemas-microsoft-com:office:office" xmlns:oel="http://schemas.microsoft.com/office/2019/extlst" xmlns:r="http://schemas.openxmlformats.org/officeDocument/2006/relationships" xmlns:m="http://schemas.openxmlformats.org/officeDocument/2006/math" xmlns:v="urn:schemas-microsoft-com:vml" xmlns:wp14="http://schemas.microsoft.com/office/word/2010/wordprocessingDrawing" xmlns:wp="http://schemas.openxmlformats.org/drawingml/2006/wordprocessingDrawing" xmlns:w10="urn:schemas-microsoft-com:office:word" xmlns:w="http://schemas.openxmlformats.org/wordprocessingml/2006/main" xmlns:w14="http://schemas.microsoft.com/office/word/2010/wordml" xmlns:w15="http://schemas.microsoft.com/office/word/2012/wordml" xmlns:w16cei="http://schemas.microsoft.com/office/word/2026/wordml/cei" xmlns:w16cex="http://schemas.microsoft.com/office/word/2018/wordml/cex" xmlns:w16cid="http://schemas.microsoft.com/office/word/2016/wordml/cid" xmlns:w16="http://schemas.microsoft.com/office/word/2018/wordml" xmlns:w16du="http://schemas.microsoft.com/office/word/2023/wordml/word16du" xmlns:w16sdtdh="http://schemas.microsoft.com/office/word/2020/wordml/sdtdatahash" xmlns:w16sdtfl="http://schemas.microsoft.com/office/word/2024/wordml/sdtformatlock" xmlns:w16se="http://schemas.microsoft.com/office/word/2015/wordml/symex" xmlns:wpg="http://schemas.microsoft.com/office/word/2010/wordprocessingGroup" xmlns:wpi="http://schemas.microsoft.com/office/word/2010/wordprocessingInk" xmlns:wne="http://schemas.microsoft.com/office/word/2006/wordml" xmlns:wps="http://schemas.microsoft.com/office/word/2010/wordprocessingShape" mc:Ignorable="w14 w15 w16se w16cid w16 w16cex w16sdtdh w16sdtfl w16du wp14">
   <w:body>
     <w:p>
       <w:pPr>
@@ -113,7 +113,7 @@
           <w:sz w:val="22"/>
           <w:szCs w:val="22"/>
         </w:rPr>
-        <w:t>4</w:t>
+        <w:t>8</w:t>
       </w:r>
       <w:r>
         <w:rPr>
@@ -129,7 +129,7 @@
           <w:sz w:val="22"/>
           <w:szCs w:val="22"/>
         </w:rPr>
-        <w:t>7</w:t>
+        <w:t>8</w:t>
       </w:r>
       <w:r>
         <w:rPr>
@@ -5195,7 +5195,40 @@
           <w:sz w:val="22"/>
           <w:szCs w:val="22"/>
         </w:rPr>
-        <w:t xml:space="preserve"> to be done soon</w:t>
+        <w:t xml:space="preserve"> </w:t>
+      </w:r>
+      <w:r>
+        <w:rPr>
+          <w:sz w:val="22"/>
+          <w:szCs w:val="22"/>
+        </w:rPr>
+        <w:t xml:space="preserve">Claude-generated diagram is available in </w:t>
+      </w:r>
+      <w:hyperlink r:id="rId13" w:history="1">
+        <w:r>
+          <w:rPr>
+            <w:rStyle w:val="Hyperlink"/>
+            <w:rFonts w:ascii="Courier New" w:hAnsi="Courier New" w:cs="Courier New"/>
+            <w:sz w:val="22"/>
+            <w:szCs w:val="22"/>
+          </w:rPr>
+          <w:t>/output/search_output/PRISMA_flow_numbers.xlsx</w:t>
+        </w:r>
+      </w:hyperlink>
+      <w:r>
+        <w:rPr>
+          <w:rFonts w:ascii="Courier New" w:hAnsi="Courier New" w:cs="Courier New"/>
+          <w:sz w:val="22"/>
+          <w:szCs w:val="22"/>
+        </w:rPr>
+        <w:t xml:space="preserve"> </w:t>
+      </w:r>
+      <w:r>
+        <w:rPr>
+          <w:sz w:val="22"/>
+          <w:szCs w:val="22"/>
+        </w:rPr>
+        <w:t>and pending manual check by Amelia.</w:t>
       </w:r>
     </w:p>
     <w:p>
@@ -5506,9 +5539,27 @@
           <w:sz w:val="22"/>
           <w:szCs w:val="22"/>
         </w:rPr>
-        <w:t xml:space="preserve"> UPDATE (28.05.2026): Done, results can be accessed in </w:t>
-      </w:r>
-      <w:hyperlink r:id="rId13" w:history="1">
+        <w:t xml:space="preserve"> </w:t>
+      </w:r>
+      <w:r>
+        <w:rPr>
+          <w:b/>
+          <w:bCs/>
+          <w:color w:val="EE0000"/>
+          <w:sz w:val="22"/>
+          <w:szCs w:val="22"/>
+        </w:rPr>
+        <w:t>UPDATE (28.05.2026)</w:t>
+      </w:r>
+      <w:r>
+        <w:rPr>
+          <w:color w:val="000000"/>
+          <w:sz w:val="22"/>
+          <w:szCs w:val="22"/>
+        </w:rPr>
+        <w:t xml:space="preserve">: Done, results can be accessed in </w:t>
+      </w:r>
+      <w:hyperlink r:id="rId14" w:history="1">
         <w:r>
           <w:rPr>
             <w:rStyle w:val="Hyperlink"/>
@@ -5516,7 +5567,16 @@
             <w:sz w:val="22"/>
             <w:szCs w:val="22"/>
           </w:rPr>
-          <w:t>/lit_search_output</w:t>
+          <w:t>/</w:t>
+        </w:r>
+        <w:r>
+          <w:rPr>
+            <w:rStyle w:val="Hyperlink"/>
+            <w:rFonts w:ascii="Courier New" w:eastAsia="Courier New" w:hAnsi="Courier New" w:cs="Courier New"/>
+            <w:sz w:val="22"/>
+            <w:szCs w:val="22"/>
+          </w:rPr>
+          <w:t>output/search_output</w:t>
         </w:r>
       </w:hyperlink>
       <w:r>
@@ -5535,14 +5595,36 @@
         </w:rPr>
         <w:t>(</w:t>
       </w:r>
+      <w:hyperlink r:id="rId15" w:history="1">
+        <w:r>
+          <w:rPr>
+            <w:rStyle w:val="Hyperlink"/>
+            <w:rFonts w:eastAsia="Courier New" w:cs="Courier New"/>
+            <w:sz w:val="22"/>
+            <w:szCs w:val="22"/>
+          </w:rPr>
+          <w:t>11_irr_sample_descriptive.csv</w:t>
+        </w:r>
+      </w:hyperlink>
       <w:r>
         <w:rPr>
           <w:rFonts w:eastAsia="Courier New" w:cs="Courier New"/>
           <w:sz w:val="22"/>
           <w:szCs w:val="22"/>
         </w:rPr>
-        <w:t>11_irr_sample_descriptive.csv and 11_irr_sample_criteria.csv</w:t>
-      </w:r>
+        <w:t xml:space="preserve"> and </w:t>
+      </w:r>
+      <w:hyperlink r:id="rId16" w:history="1">
+        <w:r>
+          <w:rPr>
+            <w:rStyle w:val="Hyperlink"/>
+            <w:rFonts w:eastAsia="Courier New" w:cs="Courier New"/>
+            <w:sz w:val="22"/>
+            <w:szCs w:val="22"/>
+          </w:rPr>
+          <w:t>11_irr_sample_criteria.csv</w:t>
+        </w:r>
+      </w:hyperlink>
       <w:r>
         <w:rPr>
           <w:rFonts w:eastAsia="Courier New" w:cs="Courier New"/>
@@ -5815,7 +5897,23 @@
           <w:sz w:val="22"/>
           <w:szCs w:val="22"/>
         </w:rPr>
-        <w:t xml:space="preserve"> “reconciliation meeting” will be conducted in the case of high discrepancy between RA</w:t>
+        <w:t xml:space="preserve"> “reconciliation meeting” w</w:t>
+      </w:r>
+      <w:r>
+        <w:rPr>
+          <w:color w:val="000000"/>
+          <w:sz w:val="22"/>
+          <w:szCs w:val="22"/>
+        </w:rPr>
+        <w:t>ould</w:t>
+      </w:r>
+      <w:r>
+        <w:rPr>
+          <w:color w:val="000000"/>
+          <w:sz w:val="22"/>
+          <w:szCs w:val="22"/>
+        </w:rPr>
+        <w:t xml:space="preserve"> be conducted in the case of high discrepancy between RA</w:t>
       </w:r>
       <w:r>
         <w:rPr>
@@ -5848,6 +5946,40 @@
           <w:szCs w:val="22"/>
         </w:rPr>
         <w:t>.</w:t>
+      </w:r>
+      <w:r>
+        <w:rPr>
+          <w:color w:val="000000"/>
+          <w:sz w:val="22"/>
+          <w:szCs w:val="22"/>
+        </w:rPr>
+        <w:t xml:space="preserve"> </w:t>
+      </w:r>
+      <w:r>
+        <w:rPr>
+          <w:b/>
+          <w:bCs/>
+          <w:color w:val="EE0000"/>
+          <w:sz w:val="22"/>
+          <w:szCs w:val="22"/>
+        </w:rPr>
+        <w:t xml:space="preserve">UPDATE (20.08.2026) </w:t>
+      </w:r>
+      <w:r>
+        <w:rPr>
+          <w:color w:val="000000"/>
+          <w:sz w:val="22"/>
+          <w:szCs w:val="22"/>
+        </w:rPr>
+        <w:t>IRR for 10 single-select items were rather low (between 0.230 – 0.602), but reconciliation meeting cannot be held as Inneke is resigned per August 2026</w:t>
+      </w:r>
+      <w:r>
+        <w:rPr>
+          <w:color w:val="000000"/>
+          <w:sz w:val="22"/>
+          <w:szCs w:val="22"/>
+        </w:rPr>
+        <w:t>. A reconciliation meeting doesn’t make sense as the coding process is finished anyway. IRR will be reported as it is, and full coding by Amelia will be reported as descriptive findings.</w:t>
       </w:r>
     </w:p>
     <w:p>
@@ -5877,7 +6009,7 @@
         </w:rPr>
         <w:t xml:space="preserve">Codebook can be found here </w:t>
       </w:r>
-      <w:hyperlink r:id="rId14">
+      <w:hyperlink r:id="rId17">
         <w:r>
           <w:rPr>
             <w:color w:val="0000EE"/>
@@ -5957,6 +6089,7 @@
           <w:sz w:val="22"/>
           <w:szCs w:val="22"/>
         </w:rPr>
+        <w:lastRenderedPageBreak/>
         <w:t xml:space="preserve">Discipline specific as a focus? </w:t>
       </w:r>
       <w:r>
@@ -6069,7 +6202,6 @@
           <w:sz w:val="22"/>
           <w:szCs w:val="22"/>
         </w:rPr>
-        <w:lastRenderedPageBreak/>
         <w:t>Definition:</w:t>
       </w:r>
       <w:r>
@@ -11674,7 +11806,23 @@
           <w:sz w:val="22"/>
           <w:szCs w:val="22"/>
         </w:rPr>
-        <w:t>Visualizing the dependency logic of the reproducibility criteria</w:t>
+        <w:t xml:space="preserve">Visualizing the dependency </w:t>
+      </w:r>
+      <w:r>
+        <w:rPr>
+          <w:color w:val="000000"/>
+          <w:sz w:val="22"/>
+          <w:szCs w:val="22"/>
+        </w:rPr>
+        <w:t>diagram</w:t>
+      </w:r>
+      <w:r>
+        <w:rPr>
+          <w:color w:val="000000"/>
+          <w:sz w:val="22"/>
+          <w:szCs w:val="22"/>
+        </w:rPr>
+        <w:t xml:space="preserve"> of the reproducibility criteria</w:t>
       </w:r>
     </w:p>
     <w:p>
@@ -11917,7 +12065,7 @@
 </file>
 
 <file path=word/comments.xml><?xml version="1.0" encoding="utf-8"?>
-<w:comments xmlns:wpc="http://schemas.microsoft.com/office/word/2010/wordprocessingCanvas" xmlns:cx="http://schemas.microsoft.com/office/drawing/2014/chartex" xmlns:cx1="http://schemas.microsoft.com/office/drawing/2015/9/8/chartex" xmlns:cx2="http://schemas.microsoft.com/office/drawing/2015/10/21/chartex" xmlns:cx3="http://schemas.microsoft.com/office/drawing/2016/5/9/chartex" xmlns:cx4="http://schemas.microsoft.com/office/drawing/2016/5/10/chartex" xmlns:cx5="http://schemas.microsoft.com/office/drawing/2016/5/11/chartex" xmlns:cx6="http://schemas.microsoft.com/office/drawing/2016/5/12/chartex" xmlns:cx7="http://schemas.microsoft.com/office/drawing/2016/5/13/chartex" xmlns:cx8="http://schemas.microsoft.com/office/drawing/2016/5/14/chartex" xmlns:mc="http://schemas.openxmlformats.org/markup-compatibility/2006" xmlns:aink="http://schemas.microsoft.com/office/drawing/2016/ink" xmlns:am3d="http://schemas.microsoft.com/office/drawing/2017/model3d" xmlns:o="urn:schemas-microsoft-com:office:office" xmlns:oel="http://schemas.microsoft.com/office/2019/extlst" xmlns:r="http://schemas.openxmlformats.org/officeDocument/2006/relationships" xmlns:m="http://schemas.openxmlformats.org/officeDocument/2006/math" xmlns:v="urn:schemas-microsoft-com:vml" xmlns:wp14="http://schemas.microsoft.com/office/word/2010/wordprocessingDrawing" xmlns:wp="http://schemas.openxmlformats.org/drawingml/2006/wordprocessingDrawing" xmlns:w10="urn:schemas-microsoft-com:office:word" xmlns:w="http://schemas.openxmlformats.org/wordprocessingml/2006/main" xmlns:w14="http://schemas.microsoft.com/office/word/2010/wordml" xmlns:w15="http://schemas.microsoft.com/office/word/2012/wordml" xmlns:w16cex="http://schemas.microsoft.com/office/word/2018/wordml/cex" xmlns:w16cid="http://schemas.microsoft.com/office/word/2016/wordml/cid" xmlns:w16="http://schemas.microsoft.com/office/word/2018/wordml" xmlns:w16du="http://schemas.microsoft.com/office/word/2023/wordml/word16du" xmlns:w16sdtdh="http://schemas.microsoft.com/office/word/2020/wordml/sdtdatahash" xmlns:w16sdtfl="http://schemas.microsoft.com/office/word/2024/wordml/sdtformatlock" xmlns:w16se="http://schemas.microsoft.com/office/word/2015/wordml/symex" xmlns:wpg="http://schemas.microsoft.com/office/word/2010/wordprocessingGroup" xmlns:wpi="http://schemas.microsoft.com/office/word/2010/wordprocessingInk" xmlns:wne="http://schemas.microsoft.com/office/word/2006/wordml" xmlns:wps="http://schemas.microsoft.com/office/word/2010/wordprocessingShape" mc:Ignorable="w14 w15 w16se w16cid w16 w16cex w16sdtdh w16sdtfl w16du wp14">
+<w:comments xmlns:wpc="http://schemas.microsoft.com/office/word/2010/wordprocessingCanvas" xmlns:cx="http://schemas.microsoft.com/office/drawing/2014/chartex" xmlns:cx1="http://schemas.microsoft.com/office/drawing/2015/9/8/chartex" xmlns:cx2="http://schemas.microsoft.com/office/drawing/2015/10/21/chartex" xmlns:cx3="http://schemas.microsoft.com/office/drawing/2016/5/9/chartex" xmlns:cx4="http://schemas.microsoft.com/office/drawing/2016/5/10/chartex" xmlns:cx5="http://schemas.microsoft.com/office/drawing/2016/5/11/chartex" xmlns:cx6="http://schemas.microsoft.com/office/drawing/2016/5/12/chartex" xmlns:cx7="http://schemas.microsoft.com/office/drawing/2016/5/13/chartex" xmlns:cx8="http://schemas.microsoft.com/office/drawing/2016/5/14/chartex" xmlns:mc="http://schemas.openxmlformats.org/markup-compatibility/2006" xmlns:aink="http://schemas.microsoft.com/office/drawing/2016/ink" xmlns:am3d="http://schemas.microsoft.com/office/drawing/2017/model3d" xmlns:o="urn:schemas-microsoft-com:office:office" xmlns:oel="http://schemas.microsoft.com/office/2019/extlst" xmlns:r="http://schemas.openxmlformats.org/officeDocument/2006/relationships" xmlns:m="http://schemas.openxmlformats.org/officeDocument/2006/math" xmlns:v="urn:schemas-microsoft-com:vml" xmlns:wp14="http://schemas.microsoft.com/office/word/2010/wordprocessingDrawing" xmlns:wp="http://schemas.openxmlformats.org/drawingml/2006/wordprocessingDrawing" xmlns:w10="urn:schemas-microsoft-com:office:word" xmlns:w="http://schemas.openxmlformats.org/wordprocessingml/2006/main" xmlns:w14="http://schemas.microsoft.com/office/word/2010/wordml" xmlns:w15="http://schemas.microsoft.com/office/word/2012/wordml" xmlns:w16cei="http://schemas.microsoft.com/office/word/2026/wordml/cei" xmlns:w16cex="http://schemas.microsoft.com/office/word/2018/wordml/cex" xmlns:w16cid="http://schemas.microsoft.com/office/word/2016/wordml/cid" xmlns:w16="http://schemas.microsoft.com/office/word/2018/wordml" xmlns:w16du="http://schemas.microsoft.com/office/word/2023/wordml/word16du" xmlns:w16sdtdh="http://schemas.microsoft.com/office/word/2020/wordml/sdtdatahash" xmlns:w16sdtfl="http://schemas.microsoft.com/office/word/2024/wordml/sdtformatlock" xmlns:w16se="http://schemas.microsoft.com/office/word/2015/wordml/symex" xmlns:wpg="http://schemas.microsoft.com/office/word/2010/wordprocessingGroup" xmlns:wpi="http://schemas.microsoft.com/office/word/2010/wordprocessingInk" xmlns:wne="http://schemas.microsoft.com/office/word/2006/wordml" xmlns:wps="http://schemas.microsoft.com/office/word/2010/wordprocessingShape" mc:Ignorable="w14 w15 w16se w16cid w16 w16cex w16sdtdh w16sdtfl w16du wp14">
   <w:comment w:id="0" w:author="Amelia Zein" w:date="2026-04-20T11:30:00Z" w:initials="">
     <w:p>
       <w:pPr>
@@ -12240,7 +12388,7 @@
 </file>
 
 <file path=word/commentsExtended.xml><?xml version="1.0" encoding="utf-8"?>
-<w15:commentsEx xmlns:wpc="http://schemas.microsoft.com/office/word/2010/wordprocessingCanvas" xmlns:cx="http://schemas.microsoft.com/office/drawing/2014/chartex" xmlns:cx1="http://schemas.microsoft.com/office/drawing/2015/9/8/chartex" xmlns:cx2="http://schemas.microsoft.com/office/drawing/2015/10/21/chartex" xmlns:cx3="http://schemas.microsoft.com/office/drawing/2016/5/9/chartex" xmlns:cx4="http://schemas.microsoft.com/office/drawing/2016/5/10/chartex" xmlns:cx5="http://schemas.microsoft.com/office/drawing/2016/5/11/chartex" xmlns:cx6="http://schemas.microsoft.com/office/drawing/2016/5/12/chartex" xmlns:cx7="http://schemas.microsoft.com/office/drawing/2016/5/13/chartex" xmlns:cx8="http://schemas.microsoft.com/office/drawing/2016/5/14/chartex" xmlns:mc="http://schemas.openxmlformats.org/markup-compatibility/2006" xmlns:aink="http://schemas.microsoft.com/office/drawing/2016/ink" xmlns:am3d="http://schemas.microsoft.com/office/drawing/2017/model3d" xmlns:o="urn:schemas-microsoft-com:office:office" xmlns:oel="http://schemas.microsoft.com/office/2019/extlst" xmlns:r="http://schemas.openxmlformats.org/officeDocument/2006/relationships" xmlns:m="http://schemas.openxmlformats.org/officeDocument/2006/math" xmlns:v="urn:schemas-microsoft-com:vml" xmlns:wp14="http://schemas.microsoft.com/office/word/2010/wordprocessingDrawing" xmlns:wp="http://schemas.openxmlformats.org/drawingml/2006/wordprocessingDrawing" xmlns:w10="urn:schemas-microsoft-com:office:word" xmlns:w="http://schemas.openxmlformats.org/wordprocessingml/2006/main" xmlns:w14="http://schemas.microsoft.com/office/word/2010/wordml" xmlns:w15="http://schemas.microsoft.com/office/word/2012/wordml" xmlns:w16cex="http://schemas.microsoft.com/office/word/2018/wordml/cex" xmlns:w16cid="http://schemas.microsoft.com/office/word/2016/wordml/cid" xmlns:w16="http://schemas.microsoft.com/office/word/2018/wordml" xmlns:w16du="http://schemas.microsoft.com/office/word/2023/wordml/word16du" xmlns:w16sdtdh="http://schemas.microsoft.com/office/word/2020/wordml/sdtdatahash" xmlns:w16sdtfl="http://schemas.microsoft.com/office/word/2024/wordml/sdtformatlock" xmlns:w16se="http://schemas.microsoft.com/office/word/2015/wordml/symex" xmlns:wpg="http://schemas.microsoft.com/office/word/2010/wordprocessingGroup" xmlns:wpi="http://schemas.microsoft.com/office/word/2010/wordprocessingInk" xmlns:wne="http://schemas.microsoft.com/office/word/2006/wordml" xmlns:wps="http://schemas.microsoft.com/office/word/2010/wordprocessingShape" mc:Ignorable="w14 w15 w16se w16cid w16 w16cex w16sdtdh w16sdtfl w16du wp14">
+<w15:commentsEx xmlns:wpc="http://schemas.microsoft.com/office/word/2010/wordprocessingCanvas" xmlns:cx="http://schemas.microsoft.com/office/drawing/2014/chartex" xmlns:cx1="http://schemas.microsoft.com/office/drawing/2015/9/8/chartex" xmlns:cx2="http://schemas.microsoft.com/office/drawing/2015/10/21/chartex" xmlns:cx3="http://schemas.microsoft.com/office/drawing/2016/5/9/chartex" xmlns:cx4="http://schemas.microsoft.com/office/drawing/2016/5/10/chartex" xmlns:cx5="http://schemas.microsoft.com/office/drawing/2016/5/11/chartex" xmlns:cx6="http://schemas.microsoft.com/office/drawing/2016/5/12/chartex" xmlns:cx7="http://schemas.microsoft.com/office/drawing/2016/5/13/chartex" xmlns:cx8="http://schemas.microsoft.com/office/drawing/2016/5/14/chartex" xmlns:mc="http://schemas.openxmlformats.org/markup-compatibility/2006" xmlns:aink="http://schemas.microsoft.com/office/drawing/2016/ink" xmlns:am3d="http://schemas.microsoft.com/office/drawing/2017/model3d" xmlns:o="urn:schemas-microsoft-com:office:office" xmlns:oel="http://schemas.microsoft.com/office/2019/extlst" xmlns:r="http://schemas.openxmlformats.org/officeDocument/2006/relationships" xmlns:m="http://schemas.openxmlformats.org/officeDocument/2006/math" xmlns:v="urn:schemas-microsoft-com:vml" xmlns:wp14="http://schemas.microsoft.com/office/word/2010/wordprocessingDrawing" xmlns:wp="http://schemas.openxmlformats.org/drawingml/2006/wordprocessingDrawing" xmlns:w10="urn:schemas-microsoft-com:office:word" xmlns:w="http://schemas.openxmlformats.org/wordprocessingml/2006/main" xmlns:w14="http://schemas.microsoft.com/office/word/2010/wordml" xmlns:w15="http://schemas.microsoft.com/office/word/2012/wordml" xmlns:w16cei="http://schemas.microsoft.com/office/word/2026/wordml/cei" xmlns:w16cex="http://schemas.microsoft.com/office/word/2018/wordml/cex" xmlns:w16cid="http://schemas.microsoft.com/office/word/2016/wordml/cid" xmlns:w16="http://schemas.microsoft.com/office/word/2018/wordml" xmlns:w16du="http://schemas.microsoft.com/office/word/2023/wordml/word16du" xmlns:w16sdtdh="http://schemas.microsoft.com/office/word/2020/wordml/sdtdatahash" xmlns:w16sdtfl="http://schemas.microsoft.com/office/word/2024/wordml/sdtformatlock" xmlns:w16se="http://schemas.microsoft.com/office/word/2015/wordml/symex" xmlns:wpg="http://schemas.microsoft.com/office/word/2010/wordprocessingGroup" xmlns:wpi="http://schemas.microsoft.com/office/word/2010/wordprocessingInk" xmlns:wne="http://schemas.microsoft.com/office/word/2006/wordml" xmlns:wps="http://schemas.microsoft.com/office/word/2010/wordprocessingShape" mc:Ignorable="w14 w15 w16se w16cid w16 w16cex w16sdtdh w16sdtfl w16du wp14">
   <w15:commentEx w15:paraId="000000F1" w15:done="0"/>
   <w15:commentEx w15:paraId="000000F5" w15:paraIdParent="000000F1" w15:done="0"/>
   <w15:commentEx w15:paraId="2208FF40" w15:paraIdParent="000000F1" w15:done="0"/>
@@ -12250,14 +12398,14 @@
 </file>
 
 <file path=word/commentsExtensible.xml><?xml version="1.0" encoding="utf-8"?>
-<w16cex:commentsExtensible xmlns:wpc="http://schemas.microsoft.com/office/word/2010/wordprocessingCanvas" xmlns:cx="http://schemas.microsoft.com/office/drawing/2014/chartex" xmlns:cx1="http://schemas.microsoft.com/office/drawing/2015/9/8/chartex" xmlns:cx2="http://schemas.microsoft.com/office/drawing/2015/10/21/chartex" xmlns:cx3="http://schemas.microsoft.com/office/drawing/2016/5/9/chartex" xmlns:cx4="http://schemas.microsoft.com/office/drawing/2016/5/10/chartex" xmlns:cx5="http://schemas.microsoft.com/office/drawing/2016/5/11/chartex" xmlns:cx6="http://schemas.microsoft.com/office/drawing/2016/5/12/chartex" xmlns:cx7="http://schemas.microsoft.com/office/drawing/2016/5/13/chartex" xmlns:cx8="http://schemas.microsoft.com/office/drawing/2016/5/14/chartex" xmlns:cr="http://schemas.microsoft.com/office/comments/2020/reactions" xmlns:mc="http://schemas.openxmlformats.org/markup-compatibility/2006" xmlns:aink="http://schemas.microsoft.com/office/drawing/2016/ink" xmlns:am3d="http://schemas.microsoft.com/office/drawing/2017/model3d" xmlns:o="urn:schemas-microsoft-com:office:office" xmlns:oel="http://schemas.microsoft.com/office/2019/extlst" xmlns:r="http://schemas.openxmlformats.org/officeDocument/2006/relationships" xmlns:m="http://schemas.openxmlformats.org/officeDocument/2006/math" xmlns:v="urn:schemas-microsoft-com:vml" xmlns:wp14="http://schemas.microsoft.com/office/word/2010/wordprocessingDrawing" xmlns:wp="http://schemas.openxmlformats.org/drawingml/2006/wordprocessingDrawing" xmlns:w10="urn:schemas-microsoft-com:office:word" xmlns:w="http://schemas.openxmlformats.org/wordprocessingml/2006/main" xmlns:w14="http://schemas.microsoft.com/office/word/2010/wordml" xmlns:w15="http://schemas.microsoft.com/office/word/2012/wordml" xmlns:w16cex="http://schemas.microsoft.com/office/word/2018/wordml/cex" xmlns:w16cid="http://schemas.microsoft.com/office/word/2016/wordml/cid" xmlns:w16="http://schemas.microsoft.com/office/word/2018/wordml" xmlns:w16du="http://schemas.microsoft.com/office/word/2023/wordml/word16du" xmlns:w16sdtdh="http://schemas.microsoft.com/office/word/2020/wordml/sdtdatahash" xmlns:w16sdtfl="http://schemas.microsoft.com/office/word/2024/wordml/sdtformatlock" xmlns:w16se="http://schemas.microsoft.com/office/word/2015/wordml/symex" xmlns:wpg="http://schemas.microsoft.com/office/word/2010/wordprocessingGroup" xmlns:wpi="http://schemas.microsoft.com/office/word/2010/wordprocessingInk" xmlns:wne="http://schemas.microsoft.com/office/word/2006/wordml" xmlns:wps="http://schemas.microsoft.com/office/word/2010/wordprocessingShape" mc:Ignorable="w14 w15 w16se w16cid w16 w16cex w16sdtdh w16sdtfl cr w16du wp14">
+<w16cex:commentsExtensible xmlns:wpc="http://schemas.microsoft.com/office/word/2010/wordprocessingCanvas" xmlns:cx="http://schemas.microsoft.com/office/drawing/2014/chartex" xmlns:cx1="http://schemas.microsoft.com/office/drawing/2015/9/8/chartex" xmlns:cx2="http://schemas.microsoft.com/office/drawing/2015/10/21/chartex" xmlns:cx3="http://schemas.microsoft.com/office/drawing/2016/5/9/chartex" xmlns:cx4="http://schemas.microsoft.com/office/drawing/2016/5/10/chartex" xmlns:cx5="http://schemas.microsoft.com/office/drawing/2016/5/11/chartex" xmlns:cx6="http://schemas.microsoft.com/office/drawing/2016/5/12/chartex" xmlns:cx7="http://schemas.microsoft.com/office/drawing/2016/5/13/chartex" xmlns:cx8="http://schemas.microsoft.com/office/drawing/2016/5/14/chartex" xmlns:cr="http://schemas.microsoft.com/office/comments/2020/reactions" xmlns:mc="http://schemas.openxmlformats.org/markup-compatibility/2006" xmlns:aink="http://schemas.microsoft.com/office/drawing/2016/ink" xmlns:am3d="http://schemas.microsoft.com/office/drawing/2017/model3d" xmlns:o="urn:schemas-microsoft-com:office:office" xmlns:oel="http://schemas.microsoft.com/office/2019/extlst" xmlns:r="http://schemas.openxmlformats.org/officeDocument/2006/relationships" xmlns:m="http://schemas.openxmlformats.org/officeDocument/2006/math" xmlns:v="urn:schemas-microsoft-com:vml" xmlns:wp14="http://schemas.microsoft.com/office/word/2010/wordprocessingDrawing" xmlns:wp="http://schemas.openxmlformats.org/drawingml/2006/wordprocessingDrawing" xmlns:w10="urn:schemas-microsoft-com:office:word" xmlns:w="http://schemas.openxmlformats.org/wordprocessingml/2006/main" xmlns:w14="http://schemas.microsoft.com/office/word/2010/wordml" xmlns:w15="http://schemas.microsoft.com/office/word/2012/wordml" xmlns:w16cei="http://schemas.microsoft.com/office/word/2026/wordml/cei" xmlns:w16cex="http://schemas.microsoft.com/office/word/2018/wordml/cex" xmlns:w16cid="http://schemas.microsoft.com/office/word/2016/wordml/cid" xmlns:w16="http://schemas.microsoft.com/office/word/2018/wordml" xmlns:w16du="http://schemas.microsoft.com/office/word/2023/wordml/word16du" xmlns:w16sdtdh="http://schemas.microsoft.com/office/word/2020/wordml/sdtdatahash" xmlns:w16sdtfl="http://schemas.microsoft.com/office/word/2024/wordml/sdtformatlock" xmlns:w16se="http://schemas.microsoft.com/office/word/2015/wordml/symex" xmlns:wpg="http://schemas.microsoft.com/office/word/2010/wordprocessingGroup" xmlns:wpi="http://schemas.microsoft.com/office/word/2010/wordprocessingInk" xmlns:wne="http://schemas.microsoft.com/office/word/2006/wordml" xmlns:wps="http://schemas.microsoft.com/office/word/2010/wordprocessingShape" mc:Ignorable="w14 w15 w16se w16cid w16 w16cex w16sdtdh w16sdtfl cr w16du wp14">
   <w16cex:commentExtensible w16cex:durableId="4E397F5F" w16cex:dateUtc="2026-05-05T06:35:00Z"/>
   <w16cex:commentExtensible w16cex:durableId="49457E0B" w16cex:dateUtc="2026-05-05T06:17:00Z"/>
 </w16cex:commentsExtensible>
 </file>
 
 <file path=word/commentsIds.xml><?xml version="1.0" encoding="utf-8"?>
-<w16cid:commentsIds xmlns:wpc="http://schemas.microsoft.com/office/word/2010/wordprocessingCanvas" xmlns:cx="http://schemas.microsoft.com/office/drawing/2014/chartex" xmlns:cx1="http://schemas.microsoft.com/office/drawing/2015/9/8/chartex" xmlns:cx2="http://schemas.microsoft.com/office/drawing/2015/10/21/chartex" xmlns:cx3="http://schemas.microsoft.com/office/drawing/2016/5/9/chartex" xmlns:cx4="http://schemas.microsoft.com/office/drawing/2016/5/10/chartex" xmlns:cx5="http://schemas.microsoft.com/office/drawing/2016/5/11/chartex" xmlns:cx6="http://schemas.microsoft.com/office/drawing/2016/5/12/chartex" xmlns:cx7="http://schemas.microsoft.com/office/drawing/2016/5/13/chartex" xmlns:cx8="http://schemas.microsoft.com/office/drawing/2016/5/14/chartex" xmlns:mc="http://schemas.openxmlformats.org/markup-compatibility/2006" xmlns:aink="http://schemas.microsoft.com/office/drawing/2016/ink" xmlns:am3d="http://schemas.microsoft.com/office/drawing/2017/model3d" xmlns:o="urn:schemas-microsoft-com:office:office" xmlns:oel="http://schemas.microsoft.com/office/2019/extlst" xmlns:r="http://schemas.openxmlformats.org/officeDocument/2006/relationships" xmlns:m="http://schemas.openxmlformats.org/officeDocument/2006/math" xmlns:v="urn:schemas-microsoft-com:vml" xmlns:wp14="http://schemas.microsoft.com/office/word/2010/wordprocessingDrawing" xmlns:wp="http://schemas.openxmlformats.org/drawingml/2006/wordprocessingDrawing" xmlns:w10="urn:schemas-microsoft-com:office:word" xmlns:w="http://schemas.openxmlformats.org/wordprocessingml/2006/main" xmlns:w14="http://schemas.microsoft.com/office/word/2010/wordml" xmlns:w15="http://schemas.microsoft.com/office/word/2012/wordml" xmlns:w16cex="http://schemas.microsoft.com/office/word/2018/wordml/cex" xmlns:w16cid="http://schemas.microsoft.com/office/word/2016/wordml/cid" xmlns:w16="http://schemas.microsoft.com/office/word/2018/wordml" xmlns:w16du="http://schemas.microsoft.com/office/word/2023/wordml/word16du" xmlns:w16sdtdh="http://schemas.microsoft.com/office/word/2020/wordml/sdtdatahash" xmlns:w16sdtfl="http://schemas.microsoft.com/office/word/2024/wordml/sdtformatlock" xmlns:w16se="http://schemas.microsoft.com/office/word/2015/wordml/symex" xmlns:wpg="http://schemas.microsoft.com/office/word/2010/wordprocessingGroup" xmlns:wpi="http://schemas.microsoft.com/office/word/2010/wordprocessingInk" xmlns:wne="http://schemas.microsoft.com/office/word/2006/wordml" xmlns:wps="http://schemas.microsoft.com/office/word/2010/wordprocessingShape" mc:Ignorable="w14 w15 w16se w16cid w16 w16cex w16sdtdh w16sdtfl w16du wp14">
+<w16cid:commentsIds xmlns:wpc="http://schemas.microsoft.com/office/word/2010/wordprocessingCanvas" xmlns:cx="http://schemas.microsoft.com/office/drawing/2014/chartex" xmlns:cx1="http://schemas.microsoft.com/office/drawing/2015/9/8/chartex" xmlns:cx2="http://schemas.microsoft.com/office/drawing/2015/10/21/chartex" xmlns:cx3="http://schemas.microsoft.com/office/drawing/2016/5/9/chartex" xmlns:cx4="http://schemas.microsoft.com/office/drawing/2016/5/10/chartex" xmlns:cx5="http://schemas.microsoft.com/office/drawing/2016/5/11/chartex" xmlns:cx6="http://schemas.microsoft.com/office/drawing/2016/5/12/chartex" xmlns:cx7="http://schemas.microsoft.com/office/drawing/2016/5/13/chartex" xmlns:cx8="http://schemas.microsoft.com/office/drawing/2016/5/14/chartex" xmlns:mc="http://schemas.openxmlformats.org/markup-compatibility/2006" xmlns:aink="http://schemas.microsoft.com/office/drawing/2016/ink" xmlns:am3d="http://schemas.microsoft.com/office/drawing/2017/model3d" xmlns:o="urn:schemas-microsoft-com:office:office" xmlns:oel="http://schemas.microsoft.com/office/2019/extlst" xmlns:r="http://schemas.openxmlformats.org/officeDocument/2006/relationships" xmlns:m="http://schemas.openxmlformats.org/officeDocument/2006/math" xmlns:v="urn:schemas-microsoft-com:vml" xmlns:wp14="http://schemas.microsoft.com/office/word/2010/wordprocessingDrawing" xmlns:wp="http://schemas.openxmlformats.org/drawingml/2006/wordprocessingDrawing" xmlns:w10="urn:schemas-microsoft-com:office:word" xmlns:w="http://schemas.openxmlformats.org/wordprocessingml/2006/main" xmlns:w14="http://schemas.microsoft.com/office/word/2010/wordml" xmlns:w15="http://schemas.microsoft.com/office/word/2012/wordml" xmlns:w16cei="http://schemas.microsoft.com/office/word/2026/wordml/cei" xmlns:w16cex="http://schemas.microsoft.com/office/word/2018/wordml/cex" xmlns:w16cid="http://schemas.microsoft.com/office/word/2016/wordml/cid" xmlns:w16="http://schemas.microsoft.com/office/word/2018/wordml" xmlns:w16du="http://schemas.microsoft.com/office/word/2023/wordml/word16du" xmlns:w16sdtdh="http://schemas.microsoft.com/office/word/2020/wordml/sdtdatahash" xmlns:w16sdtfl="http://schemas.microsoft.com/office/word/2024/wordml/sdtformatlock" xmlns:w16se="http://schemas.microsoft.com/office/word/2015/wordml/symex" xmlns:wpg="http://schemas.microsoft.com/office/word/2010/wordprocessingGroup" xmlns:wpi="http://schemas.microsoft.com/office/word/2010/wordprocessingInk" xmlns:wne="http://schemas.microsoft.com/office/word/2006/wordml" xmlns:wps="http://schemas.microsoft.com/office/word/2010/wordprocessingShape" mc:Ignorable="w14 w15 w16se w16cid w16 w16cex w16sdtdh w16sdtfl w16du wp14">
   <w16cid:commentId w16cid:paraId="000000F1" w16cid:durableId="000000F1"/>
   <w16cid:commentId w16cid:paraId="000000F5" w16cid:durableId="000000F5"/>
   <w16cid:commentId w16cid:paraId="2208FF40" w16cid:durableId="4E397F5F"/>
@@ -12267,7 +12415,7 @@
 </file>
 
 <file path=word/numbering.xml><?xml version="1.0" encoding="utf-8"?>
-<w:numbering xmlns:wpc="http://schemas.microsoft.com/office/word/2010/wordprocessingCanvas" xmlns:cx="http://schemas.microsoft.com/office/drawing/2014/chartex" xmlns:cx1="http://schemas.microsoft.com/office/drawing/2015/9/8/chartex" xmlns:cx2="http://schemas.microsoft.com/office/drawing/2015/10/21/chartex" xmlns:cx3="http://schemas.microsoft.com/office/drawing/2016/5/9/chartex" xmlns:cx4="http://schemas.microsoft.com/office/drawing/2016/5/10/chartex" xmlns:cx5="http://schemas.microsoft.com/office/drawing/2016/5/11/chartex" xmlns:cx6="http://schemas.microsoft.com/office/drawing/2016/5/12/chartex" xmlns:cx7="http://schemas.microsoft.com/office/drawing/2016/5/13/chartex" xmlns:cx8="http://schemas.microsoft.com/office/drawing/2016/5/14/chartex" xmlns:mc="http://schemas.openxmlformats.org/markup-compatibility/2006" xmlns:aink="http://schemas.microsoft.com/office/drawing/2016/ink" xmlns:am3d="http://schemas.microsoft.com/office/drawing/2017/model3d" xmlns:o="urn:schemas-microsoft-com:office:office" xmlns:oel="http://schemas.microsoft.com/office/2019/extlst" xmlns:r="http://schemas.openxmlformats.org/officeDocument/2006/relationships" xmlns:m="http://schemas.openxmlformats.org/officeDocument/2006/math" xmlns:v="urn:schemas-microsoft-com:vml" xmlns:wp14="http://schemas.microsoft.com/office/word/2010/wordprocessingDrawing" xmlns:wp="http://schemas.openxmlformats.org/drawingml/2006/wordprocessingDrawing" xmlns:w10="urn:schemas-microsoft-com:office:word" xmlns:w="http://schemas.openxmlformats.org/wordprocessingml/2006/main" xmlns:w14="http://schemas.microsoft.com/office/word/2010/wordml" xmlns:w15="http://schemas.microsoft.com/office/word/2012/wordml" xmlns:w16cex="http://schemas.microsoft.com/office/word/2018/wordml/cex" xmlns:w16cid="http://schemas.microsoft.com/office/word/2016/wordml/cid" xmlns:w16="http://schemas.microsoft.com/office/word/2018/wordml" xmlns:w16du="http://schemas.microsoft.com/office/word/2023/wordml/word16du" xmlns:w16sdtdh="http://schemas.microsoft.com/office/word/2020/wordml/sdtdatahash" xmlns:w16sdtfl="http://schemas.microsoft.com/office/word/2024/wordml/sdtformatlock" xmlns:w16se="http://schemas.microsoft.com/office/word/2015/wordml/symex" xmlns:wpg="http://schemas.microsoft.com/office/word/2010/wordprocessingGroup" xmlns:wpi="http://schemas.microsoft.com/office/word/2010/wordprocessingInk" xmlns:wne="http://schemas.microsoft.com/office/word/2006/wordml" xmlns:wps="http://schemas.microsoft.com/office/word/2010/wordprocessingShape" mc:Ignorable="w14 w15 w16se w16cid w16 w16cex w16sdtdh w16sdtfl w16du wp14">
+<w:numbering xmlns:wpc="http://schemas.microsoft.com/office/word/2010/wordprocessingCanvas" xmlns:cx="http://schemas.microsoft.com/office/drawing/2014/chartex" xmlns:cx1="http://schemas.microsoft.com/office/drawing/2015/9/8/chartex" xmlns:cx2="http://schemas.microsoft.com/office/drawing/2015/10/21/chartex" xmlns:cx3="http://schemas.microsoft.com/office/drawing/2016/5/9/chartex" xmlns:cx4="http://schemas.microsoft.com/office/drawing/2016/5/10/chartex" xmlns:cx5="http://schemas.microsoft.com/office/drawing/2016/5/11/chartex" xmlns:cx6="http://schemas.microsoft.com/office/drawing/2016/5/12/chartex" xmlns:cx7="http://schemas.microsoft.com/office/drawing/2016/5/13/chartex" xmlns:cx8="http://schemas.microsoft.com/office/drawing/2016/5/14/chartex" xmlns:mc="http://schemas.openxmlformats.org/markup-compatibility/2006" xmlns:aink="http://schemas.microsoft.com/office/drawing/2016/ink" xmlns:am3d="http://schemas.microsoft.com/office/drawing/2017/model3d" xmlns:o="urn:schemas-microsoft-com:office:office" xmlns:oel="http://schemas.microsoft.com/office/2019/extlst" xmlns:r="http://schemas.openxmlformats.org/officeDocument/2006/relationships" xmlns:m="http://schemas.openxmlformats.org/officeDocument/2006/math" xmlns:v="urn:schemas-microsoft-com:vml" xmlns:wp14="http://schemas.microsoft.com/office/word/2010/wordprocessingDrawing" xmlns:wp="http://schemas.openxmlformats.org/drawingml/2006/wordprocessingDrawing" xmlns:w10="urn:schemas-microsoft-com:office:word" xmlns:w="http://schemas.openxmlformats.org/wordprocessingml/2006/main" xmlns:w14="http://schemas.microsoft.com/office/word/2010/wordml" xmlns:w15="http://schemas.microsoft.com/office/word/2012/wordml" xmlns:w16cei="http://schemas.microsoft.com/office/word/2026/wordml/cei" xmlns:w16cex="http://schemas.microsoft.com/office/word/2018/wordml/cex" xmlns:w16cid="http://schemas.microsoft.com/office/word/2016/wordml/cid" xmlns:w16="http://schemas.microsoft.com/office/word/2018/wordml" xmlns:w16du="http://schemas.microsoft.com/office/word/2023/wordml/word16du" xmlns:w16sdtdh="http://schemas.microsoft.com/office/word/2020/wordml/sdtdatahash" xmlns:w16sdtfl="http://schemas.microsoft.com/office/word/2024/wordml/sdtformatlock" xmlns:w16se="http://schemas.microsoft.com/office/word/2015/wordml/symex" xmlns:wpg="http://schemas.microsoft.com/office/word/2010/wordprocessingGroup" xmlns:wpi="http://schemas.microsoft.com/office/word/2010/wordprocessingInk" xmlns:wne="http://schemas.microsoft.com/office/word/2006/wordml" xmlns:wps="http://schemas.microsoft.com/office/word/2010/wordprocessingShape" mc:Ignorable="w14 w15 w16se w16cid w16 w16cex w16sdtdh w16sdtfl w16du wp14">
   <w:abstractNum w:abstractNumId="0" w15:restartNumberingAfterBreak="0">
     <w:nsid w:val="017B0105"/>
     <w:multiLevelType w:val="multilevel"/>
@@ -13331,7 +13479,7 @@
 </file>
 
 <file path=word/people.xml><?xml version="1.0" encoding="utf-8"?>
-<w15:people xmlns:wpc="http://schemas.microsoft.com/office/word/2010/wordprocessingCanvas" xmlns:cx="http://schemas.microsoft.com/office/drawing/2014/chartex" xmlns:cx1="http://schemas.microsoft.com/office/drawing/2015/9/8/chartex" xmlns:cx2="http://schemas.microsoft.com/office/drawing/2015/10/21/chartex" xmlns:cx3="http://schemas.microsoft.com/office/drawing/2016/5/9/chartex" xmlns:cx4="http://schemas.microsoft.com/office/drawing/2016/5/10/chartex" xmlns:cx5="http://schemas.microsoft.com/office/drawing/2016/5/11/chartex" xmlns:cx6="http://schemas.microsoft.com/office/drawing/2016/5/12/chartex" xmlns:cx7="http://schemas.microsoft.com/office/drawing/2016/5/13/chartex" xmlns:cx8="http://schemas.microsoft.com/office/drawing/2016/5/14/chartex" xmlns:mc="http://schemas.openxmlformats.org/markup-compatibility/2006" xmlns:aink="http://schemas.microsoft.com/office/drawing/2016/ink" xmlns:am3d="http://schemas.microsoft.com/office/drawing/2017/model3d" xmlns:o="urn:schemas-microsoft-com:office:office" xmlns:oel="http://schemas.microsoft.com/office/2019/extlst" xmlns:r="http://schemas.openxmlformats.org/officeDocument/2006/relationships" xmlns:m="http://schemas.openxmlformats.org/officeDocument/2006/math" xmlns:v="urn:schemas-microsoft-com:vml" xmlns:wp14="http://schemas.microsoft.com/office/word/2010/wordprocessingDrawing" xmlns:wp="http://schemas.openxmlformats.org/drawingml/2006/wordprocessingDrawing" xmlns:w10="urn:schemas-microsoft-com:office:word" xmlns:w="http://schemas.openxmlformats.org/wordprocessingml/2006/main" xmlns:w14="http://schemas.microsoft.com/office/word/2010/wordml" xmlns:w15="http://schemas.microsoft.com/office/word/2012/wordml" xmlns:w16cex="http://schemas.microsoft.com/office/word/2018/wordml/cex" xmlns:w16cid="http://schemas.microsoft.com/office/word/2016/wordml/cid" xmlns:w16="http://schemas.microsoft.com/office/word/2018/wordml" xmlns:w16du="http://schemas.microsoft.com/office/word/2023/wordml/word16du" xmlns:w16sdtdh="http://schemas.microsoft.com/office/word/2020/wordml/sdtdatahash" xmlns:w16sdtfl="http://schemas.microsoft.com/office/word/2024/wordml/sdtformatlock" xmlns:w16se="http://schemas.microsoft.com/office/word/2015/wordml/symex" xmlns:wpg="http://schemas.microsoft.com/office/word/2010/wordprocessingGroup" xmlns:wpi="http://schemas.microsoft.com/office/word/2010/wordprocessingInk" xmlns:wne="http://schemas.microsoft.com/office/word/2006/wordml" xmlns:wps="http://schemas.microsoft.com/office/word/2010/wordprocessingShape" mc:Ignorable="w14 w15 w16se w16cid w16 w16cex w16sdtdh w16sdtfl w16du wp14">
+<w15:people xmlns:wpc="http://schemas.microsoft.com/office/word/2010/wordprocessingCanvas" xmlns:cx="http://schemas.microsoft.com/office/drawing/2014/chartex" xmlns:cx1="http://schemas.microsoft.com/office/drawing/2015/9/8/chartex" xmlns:cx2="http://schemas.microsoft.com/office/drawing/2015/10/21/chartex" xmlns:cx3="http://schemas.microsoft.com/office/drawing/2016/5/9/chartex" xmlns:cx4="http://schemas.microsoft.com/office/drawing/2016/5/10/chartex" xmlns:cx5="http://schemas.microsoft.com/office/drawing/2016/5/11/chartex" xmlns:cx6="http://schemas.microsoft.com/office/drawing/2016/5/12/chartex" xmlns:cx7="http://schemas.microsoft.com/office/drawing/2016/5/13/chartex" xmlns:cx8="http://schemas.microsoft.com/office/drawing/2016/5/14/chartex" xmlns:mc="http://schemas.openxmlformats.org/markup-compatibility/2006" xmlns:aink="http://schemas.microsoft.com/office/drawing/2016/ink" xmlns:am3d="http://schemas.microsoft.com/office/drawing/2017/model3d" xmlns:o="urn:schemas-microsoft-com:office:office" xmlns:oel="http://schemas.microsoft.com/office/2019/extlst" xmlns:r="http://schemas.openxmlformats.org/officeDocument/2006/relationships" xmlns:m="http://schemas.openxmlformats.org/officeDocument/2006/math" xmlns:v="urn:schemas-microsoft-com:vml" xmlns:wp14="http://schemas.microsoft.com/office/word/2010/wordprocessingDrawing" xmlns:wp="http://schemas.openxmlformats.org/drawingml/2006/wordprocessingDrawing" xmlns:w10="urn:schemas-microsoft-com:office:word" xmlns:w="http://schemas.openxmlformats.org/wordprocessingml/2006/main" xmlns:w14="http://schemas.microsoft.com/office/word/2010/wordml" xmlns:w15="http://schemas.microsoft.com/office/word/2012/wordml" xmlns:w16cei="http://schemas.microsoft.com/office/word/2026/wordml/cei" xmlns:w16cex="http://schemas.microsoft.com/office/word/2018/wordml/cex" xmlns:w16cid="http://schemas.microsoft.com/office/word/2016/wordml/cid" xmlns:w16="http://schemas.microsoft.com/office/word/2018/wordml" xmlns:w16du="http://schemas.microsoft.com/office/word/2023/wordml/word16du" xmlns:w16sdtdh="http://schemas.microsoft.com/office/word/2020/wordml/sdtdatahash" xmlns:w16sdtfl="http://schemas.microsoft.com/office/word/2024/wordml/sdtformatlock" xmlns:w16se="http://schemas.microsoft.com/office/word/2015/wordml/symex" xmlns:wpg="http://schemas.microsoft.com/office/word/2010/wordprocessingGroup" xmlns:wpi="http://schemas.microsoft.com/office/word/2010/wordprocessingInk" xmlns:wne="http://schemas.microsoft.com/office/word/2006/wordml" xmlns:wps="http://schemas.microsoft.com/office/word/2010/wordprocessingShape" mc:Ignorable="w14 w15 w16se w16cid w16 w16cex w16sdtdh w16sdtfl w16du wp14">
   <w15:person w15:author="Amelia Zein">
     <w15:presenceInfo w15:providerId="AD" w15:userId="S::Amelia.Zein@cais-research.de::22505ac8-7049-4143-90f5-98e1e84ea902"/>
   </w15:person>
@@ -14091,6 +14239,18 @@
       </w:tblBorders>
     </w:tblPr>
   </w:style>
+  <w:style w:type="character" w:styleId="BesuchterLink">
+    <w:name w:val="FollowedHyperlink"/>
+    <w:basedOn w:val="Absatz-Standardschriftart"/>
+    <w:uiPriority w:val="99"/>
+    <w:semiHidden/>
+    <w:unhideWhenUsed/>
+    <w:rsid w:val="0033049C"/>
+    <w:rPr>
+      <w:color w:val="800080" w:themeColor="followedHyperlink"/>
+      <w:u w:val="single"/>
+    </w:rPr>
+  </w:style>
 </w:styles>
 </file>
 

</xml_diff>